<commit_message>
edit chat history guide
</commit_message>
<xml_diff>
--- a/project/chat.docx
+++ b/project/chat.docx
@@ -548,7 +548,7 @@
           <w:szCs w:val="24"/>
           <w:u w:val="single"/>
         </w:rPr>
-        <w:t>Step 5: Save and Document the Conversation</w:t>
+        <w:t>Step 5: Save the Conversation</w:t>
       </w:r>
     </w:p>
     <w:p>
@@ -558,22 +558,48 @@
           <w:ilvl w:val="0"/>
           <w:numId w:val="5"/>
         </w:numPr>
-        <w:spacing w:after="0" w:line="240" w:lineRule="auto"/>
-        <w:rPr>
-          <w:rFonts w:ascii="Times New Roman" w:hAnsi="Times New Roman" w:cs="Times New Roman"/>
-        </w:rPr>
-      </w:pPr>
-      <w:r>
-        <w:rPr>
-          <w:rFonts w:ascii="Times New Roman" w:hAnsi="Times New Roman" w:cs="Times New Roman"/>
-        </w:rPr>
-        <w:t xml:space="preserve">When you finish, </w:t>
-      </w:r>
-      <w:r>
-        <w:rPr>
-          <w:rFonts w:ascii="Times New Roman" w:hAnsi="Times New Roman" w:cs="Times New Roman"/>
-        </w:rPr>
-        <w:t xml:space="preserve">enter the following prompt: </w:t>
+        <w:rPr>
+          <w:rFonts w:ascii="Times New Roman" w:hAnsi="Times New Roman" w:cs="Times New Roman"/>
+        </w:rPr>
+      </w:pPr>
+      <w:r>
+        <w:rPr>
+          <w:rFonts w:ascii="Times New Roman" w:hAnsi="Times New Roman" w:cs="Times New Roman"/>
+          <w:color w:val="000000"/>
+        </w:rPr>
+        <w:t>Upon completion, select the ellipsis menu (the three dots) located beside this Chat conversation.</w:t>
+      </w:r>
+    </w:p>
+    <w:p>
+      <w:pPr>
+        <w:pStyle w:val="ListParagraph"/>
+        <w:numPr>
+          <w:ilvl w:val="0"/>
+          <w:numId w:val="5"/>
+        </w:numPr>
+        <w:rPr>
+          <w:rFonts w:ascii="Times New Roman" w:hAnsi="Times New Roman" w:cs="Times New Roman"/>
+        </w:rPr>
+      </w:pPr>
+      <w:r>
+        <w:rPr>
+          <w:rFonts w:ascii="Times New Roman" w:hAnsi="Times New Roman" w:cs="Times New Roman"/>
+        </w:rPr>
+        <w:t>Click “</w:t>
+      </w:r>
+      <w:r>
+        <w:rPr>
+          <w:rFonts w:ascii="Times New Roman" w:hAnsi="Times New Roman" w:cs="Times New Roman"/>
+          <w:b/>
+          <w:bCs/>
+        </w:rPr>
+        <w:t>Share”</w:t>
+      </w:r>
+      <w:r>
+        <w:rPr>
+          <w:rFonts w:ascii="Times New Roman" w:hAnsi="Times New Roman" w:cs="Times New Roman"/>
+        </w:rPr>
+        <w:t xml:space="preserve"> to obtain the share link.</w:t>
       </w:r>
     </w:p>
     <w:tbl>
@@ -583,115 +609,14 @@
         <w:tblLook w:val="04A0" w:firstRow="1" w:lastRow="0" w:firstColumn="1" w:lastColumn="0" w:noHBand="0" w:noVBand="1"/>
       </w:tblPr>
       <w:tblGrid>
-        <w:gridCol w:w="9350"/>
+        <w:gridCol w:w="2814"/>
+        <w:gridCol w:w="6536"/>
       </w:tblGrid>
       <w:tr>
         <w:tc>
           <w:tcPr>
             <w:tcW w:w="9350" w:type="dxa"/>
-            <w:shd w:val="clear" w:color="auto" w:fill="D9F2D0" w:themeFill="accent6" w:themeFillTint="33"/>
-          </w:tcPr>
-          <w:p>
-            <w:pPr>
-              <w:ind w:left="720"/>
-              <w:rPr>
-                <w:rFonts w:ascii="Times New Roman" w:hAnsi="Times New Roman" w:cs="Times New Roman"/>
-              </w:rPr>
-            </w:pPr>
-            <w:r>
-              <w:rPr>
-                <w:rFonts w:ascii="Times New Roman" w:hAnsi="Times New Roman" w:cs="Times New Roman"/>
-              </w:rPr>
-              <w:t>Compile the entire conversation, clearly labeled to show which parts are AI inputs and which are my responses.</w:t>
-            </w:r>
-          </w:p>
-        </w:tc>
-      </w:tr>
-    </w:tbl>
-    <w:p>
-      <w:pPr>
-        <w:spacing w:after="0" w:line="240" w:lineRule="auto"/>
-        <w:rPr>
-          <w:rFonts w:ascii="Times New Roman" w:hAnsi="Times New Roman" w:cs="Times New Roman"/>
-        </w:rPr>
-      </w:pPr>
-    </w:p>
-    <w:p>
-      <w:pPr>
-        <w:pStyle w:val="ListParagraph"/>
-        <w:numPr>
-          <w:ilvl w:val="0"/>
-          <w:numId w:val="5"/>
-        </w:numPr>
-        <w:spacing w:after="0" w:line="240" w:lineRule="auto"/>
-        <w:rPr>
-          <w:rFonts w:ascii="Times New Roman" w:hAnsi="Times New Roman" w:cs="Times New Roman"/>
-        </w:rPr>
-      </w:pPr>
-      <w:r>
-        <w:rPr>
-          <w:rFonts w:ascii="Times New Roman" w:hAnsi="Times New Roman" w:cs="Times New Roman"/>
-        </w:rPr>
-        <w:lastRenderedPageBreak/>
-        <w:t xml:space="preserve">The AI will generate the entire conversation history. </w:t>
-      </w:r>
-    </w:p>
-    <w:p>
-      <w:pPr>
-        <w:pStyle w:val="ListParagraph"/>
-        <w:numPr>
-          <w:ilvl w:val="0"/>
-          <w:numId w:val="5"/>
-        </w:numPr>
-        <w:spacing w:after="0" w:line="240" w:lineRule="auto"/>
-        <w:rPr>
-          <w:rFonts w:ascii="Times New Roman" w:hAnsi="Times New Roman" w:cs="Times New Roman"/>
-        </w:rPr>
-      </w:pPr>
-      <w:r>
-        <w:rPr>
-          <w:rFonts w:ascii="Times New Roman" w:hAnsi="Times New Roman" w:cs="Times New Roman"/>
-        </w:rPr>
-        <w:t xml:space="preserve">Click </w:t>
-      </w:r>
-      <w:r>
-        <w:rPr>
-          <w:rFonts w:ascii="Times New Roman" w:hAnsi="Times New Roman" w:cs="Times New Roman"/>
-        </w:rPr>
-        <w:t>the copy icon</w:t>
-      </w:r>
-      <w:r>
-        <w:rPr>
-          <w:rFonts w:ascii="Times New Roman" w:hAnsi="Times New Roman" w:cs="Times New Roman"/>
-        </w:rPr>
-        <w:t xml:space="preserve"> below the last conversation.</w:t>
-      </w:r>
-    </w:p>
-    <w:p>
-      <w:pPr>
-        <w:pStyle w:val="ListParagraph"/>
-        <w:spacing w:after="0" w:line="240" w:lineRule="auto"/>
-        <w:rPr>
-          <w:rFonts w:ascii="Times New Roman" w:hAnsi="Times New Roman" w:cs="Times New Roman"/>
-        </w:rPr>
-      </w:pPr>
-    </w:p>
-    <w:tbl>
-      <w:tblPr>
-        <w:tblStyle w:val="TableGrid"/>
-        <w:tblW w:w="0" w:type="auto"/>
-        <w:tblLook w:val="04A0" w:firstRow="1" w:lastRow="0" w:firstColumn="1" w:lastColumn="0" w:noHBand="0" w:noVBand="1"/>
-      </w:tblPr>
-      <w:tblGrid>
-        <w:gridCol w:w="3116"/>
-        <w:gridCol w:w="3117"/>
-        <w:gridCol w:w="3117"/>
-      </w:tblGrid>
-      <w:tr>
-        <w:tc>
-          <w:tcPr>
-            <w:tcW w:w="9350" w:type="dxa"/>
-            <w:gridSpan w:val="3"/>
+            <w:gridSpan w:val="2"/>
           </w:tcPr>
           <w:p>
             <w:pPr>
@@ -704,15 +629,33 @@
               <w:rPr>
                 <w:rFonts w:ascii="Times New Roman" w:hAnsi="Times New Roman" w:cs="Times New Roman"/>
               </w:rPr>
-              <w:t>Where to find the Copy icon in different AI tools</w:t>
+              <w:lastRenderedPageBreak/>
+              <w:t xml:space="preserve">Where to find the </w:t>
+            </w:r>
+            <w:r>
+              <w:rPr>
+                <w:rFonts w:ascii="Times New Roman" w:hAnsi="Times New Roman" w:cs="Times New Roman"/>
+                <w:b/>
+                <w:bCs/>
+              </w:rPr>
+              <w:t>SHARE</w:t>
+            </w:r>
+            <w:r>
+              <w:rPr>
+                <w:rFonts w:ascii="Times New Roman" w:hAnsi="Times New Roman" w:cs="Times New Roman"/>
+              </w:rPr>
+              <w:t xml:space="preserve"> button in different AI tools</w:t>
             </w:r>
           </w:p>
         </w:tc>
       </w:tr>
       <w:tr>
+        <w:trPr>
+          <w:trHeight w:val="4652"/>
+        </w:trPr>
         <w:tc>
           <w:tcPr>
-            <w:tcW w:w="3116" w:type="dxa"/>
+            <w:tcW w:w="2814" w:type="dxa"/>
           </w:tcPr>
           <w:p>
             <w:pPr>
@@ -731,7 +674,69 @@
         </w:tc>
         <w:tc>
           <w:tcPr>
-            <w:tcW w:w="3117" w:type="dxa"/>
+            <w:tcW w:w="6536" w:type="dxa"/>
+          </w:tcPr>
+          <w:p>
+            <w:pPr>
+              <w:jc w:val="center"/>
+              <w:rPr>
+                <w:rFonts w:ascii="Times New Roman" w:hAnsi="Times New Roman" w:cs="Times New Roman"/>
+              </w:rPr>
+            </w:pPr>
+            <w:r>
+              <w:rPr>
+                <w:rFonts w:ascii="Times New Roman" w:hAnsi="Times New Roman" w:cs="Times New Roman"/>
+                <w:noProof/>
+              </w:rPr>
+              <w:drawing>
+                <wp:inline distT="0" distB="0" distL="0" distR="0" wp14:anchorId="2DDDC0F1" wp14:editId="46ADDDD4">
+                  <wp:extent cx="2332171" cy="2915216"/>
+                  <wp:effectExtent l="0" t="0" r="5080" b="6350"/>
+                  <wp:docPr id="1296438266" name="Picture 2" descr="A screenshot of a chat&#10;&#10;AI-generated content may be incorrect."/>
+                  <wp:cNvGraphicFramePr>
+                    <a:graphicFrameLocks xmlns:a="http://schemas.openxmlformats.org/drawingml/2006/main" noChangeAspect="1"/>
+                  </wp:cNvGraphicFramePr>
+                  <a:graphic xmlns:a="http://schemas.openxmlformats.org/drawingml/2006/main">
+                    <a:graphicData uri="http://schemas.openxmlformats.org/drawingml/2006/picture">
+                      <pic:pic xmlns:pic="http://schemas.openxmlformats.org/drawingml/2006/picture">
+                        <pic:nvPicPr>
+                          <pic:cNvPr id="1296438266" name="Picture 2" descr="A screenshot of a chat&#10;&#10;AI-generated content may be incorrect."/>
+                          <pic:cNvPicPr/>
+                        </pic:nvPicPr>
+                        <pic:blipFill>
+                          <a:blip r:embed="rId8" cstate="print">
+                            <a:extLst>
+                              <a:ext uri="{28A0092B-C50C-407E-A947-70E740481C1C}">
+                                <a14:useLocalDpi xmlns:a14="http://schemas.microsoft.com/office/drawing/2010/main" val="0"/>
+                              </a:ext>
+                            </a:extLst>
+                          </a:blip>
+                          <a:stretch>
+                            <a:fillRect/>
+                          </a:stretch>
+                        </pic:blipFill>
+                        <pic:spPr>
+                          <a:xfrm>
+                            <a:off x="0" y="0"/>
+                            <a:ext cx="2418342" cy="3022930"/>
+                          </a:xfrm>
+                          <a:prstGeom prst="rect">
+                            <a:avLst/>
+                          </a:prstGeom>
+                        </pic:spPr>
+                      </pic:pic>
+                    </a:graphicData>
+                  </a:graphic>
+                </wp:inline>
+              </w:drawing>
+            </w:r>
+          </w:p>
+        </w:tc>
+      </w:tr>
+      <w:tr>
+        <w:tc>
+          <w:tcPr>
+            <w:tcW w:w="2814" w:type="dxa"/>
           </w:tcPr>
           <w:p>
             <w:pPr>
@@ -750,7 +755,7 @@
         </w:tc>
         <w:tc>
           <w:tcPr>
-            <w:tcW w:w="3117" w:type="dxa"/>
+            <w:tcW w:w="6536" w:type="dxa"/>
           </w:tcPr>
           <w:p>
             <w:pPr>
@@ -762,33 +767,13 @@
             <w:r>
               <w:rPr>
                 <w:rFonts w:ascii="Times New Roman" w:hAnsi="Times New Roman" w:cs="Times New Roman"/>
-              </w:rPr>
-              <w:t>Copilot</w:t>
-            </w:r>
-          </w:p>
-        </w:tc>
-      </w:tr>
-      <w:tr>
-        <w:tc>
-          <w:tcPr>
-            <w:tcW w:w="3116" w:type="dxa"/>
-          </w:tcPr>
-          <w:p>
-            <w:pPr>
-              <w:rPr>
-                <w:rFonts w:ascii="Times New Roman" w:hAnsi="Times New Roman" w:cs="Times New Roman"/>
-              </w:rPr>
-            </w:pPr>
-            <w:r>
-              <w:rPr>
-                <w:rFonts w:ascii="Times New Roman" w:hAnsi="Times New Roman" w:cs="Times New Roman"/>
                 <w:noProof/>
               </w:rPr>
               <w:drawing>
-                <wp:inline distT="0" distB="0" distL="0" distR="0" wp14:anchorId="42EDE9C0" wp14:editId="4A654561">
-                  <wp:extent cx="1162496" cy="489857"/>
-                  <wp:effectExtent l="0" t="0" r="0" b="5715"/>
-                  <wp:docPr id="827491282" name="Picture 3" descr="A screenshot of a phone&#10;&#10;AI-generated content may be incorrect."/>
+                <wp:inline distT="0" distB="0" distL="0" distR="0" wp14:anchorId="39FB450C" wp14:editId="3CF9653E">
+                  <wp:extent cx="2217863" cy="2082297"/>
+                  <wp:effectExtent l="0" t="0" r="5080" b="635"/>
+                  <wp:docPr id="491379936" name="Picture 3" descr="A screenshot of a computer&#10;&#10;AI-generated content may be incorrect."/>
                   <wp:cNvGraphicFramePr>
                     <a:graphicFrameLocks xmlns:a="http://schemas.openxmlformats.org/drawingml/2006/main" noChangeAspect="1"/>
                   </wp:cNvGraphicFramePr>
@@ -796,66 +781,7 @@
                     <a:graphicData uri="http://schemas.openxmlformats.org/drawingml/2006/picture">
                       <pic:pic xmlns:pic="http://schemas.openxmlformats.org/drawingml/2006/picture">
                         <pic:nvPicPr>
-                          <pic:cNvPr id="827491282" name="Picture 3" descr="A screenshot of a phone&#10;&#10;AI-generated content may be incorrect."/>
-                          <pic:cNvPicPr/>
-                        </pic:nvPicPr>
-                        <pic:blipFill>
-                          <a:blip r:embed="rId8" cstate="print">
-                            <a:extLst>
-                              <a:ext uri="{28A0092B-C50C-407E-A947-70E740481C1C}">
-                                <a14:useLocalDpi xmlns:a14="http://schemas.microsoft.com/office/drawing/2010/main" val="0"/>
-                              </a:ext>
-                            </a:extLst>
-                          </a:blip>
-                          <a:stretch>
-                            <a:fillRect/>
-                          </a:stretch>
-                        </pic:blipFill>
-                        <pic:spPr>
-                          <a:xfrm>
-                            <a:off x="0" y="0"/>
-                            <a:ext cx="1233991" cy="519984"/>
-                          </a:xfrm>
-                          <a:prstGeom prst="rect">
-                            <a:avLst/>
-                          </a:prstGeom>
-                        </pic:spPr>
-                      </pic:pic>
-                    </a:graphicData>
-                  </a:graphic>
-                </wp:inline>
-              </w:drawing>
-            </w:r>
-          </w:p>
-        </w:tc>
-        <w:tc>
-          <w:tcPr>
-            <w:tcW w:w="3117" w:type="dxa"/>
-          </w:tcPr>
-          <w:p>
-            <w:pPr>
-              <w:rPr>
-                <w:rFonts w:ascii="Times New Roman" w:hAnsi="Times New Roman" w:cs="Times New Roman"/>
-              </w:rPr>
-            </w:pPr>
-            <w:r>
-              <w:rPr>
-                <w:rFonts w:ascii="Times New Roman" w:hAnsi="Times New Roman" w:cs="Times New Roman"/>
-                <w:noProof/>
-              </w:rPr>
-              <w:drawing>
-                <wp:inline distT="0" distB="0" distL="0" distR="0" wp14:anchorId="0259426A" wp14:editId="25AAF328">
-                  <wp:extent cx="1338943" cy="482019"/>
-                  <wp:effectExtent l="0" t="0" r="0" b="635"/>
-                  <wp:docPr id="509881118" name="Picture 1" descr="A screen shot of a black background&#10;&#10;AI-generated content may be incorrect."/>
-                  <wp:cNvGraphicFramePr>
-                    <a:graphicFrameLocks xmlns:a="http://schemas.openxmlformats.org/drawingml/2006/main" noChangeAspect="1"/>
-                  </wp:cNvGraphicFramePr>
-                  <a:graphic xmlns:a="http://schemas.openxmlformats.org/drawingml/2006/main">
-                    <a:graphicData uri="http://schemas.openxmlformats.org/drawingml/2006/picture">
-                      <pic:pic xmlns:pic="http://schemas.openxmlformats.org/drawingml/2006/picture">
-                        <pic:nvPicPr>
-                          <pic:cNvPr id="509881118" name="Picture 1" descr="A screen shot of a black background&#10;&#10;AI-generated content may be incorrect."/>
+                          <pic:cNvPr id="491379936" name="Picture 3" descr="A screenshot of a computer&#10;&#10;AI-generated content may be incorrect."/>
                           <pic:cNvPicPr/>
                         </pic:nvPicPr>
                         <pic:blipFill>
@@ -873,7 +799,7 @@
                         <pic:spPr>
                           <a:xfrm>
                             <a:off x="0" y="0"/>
-                            <a:ext cx="1415399" cy="509543"/>
+                            <a:ext cx="2268779" cy="2130101"/>
                           </a:xfrm>
                           <a:prstGeom prst="rect">
                             <a:avLst/>
@@ -887,12 +813,34 @@
             </w:r>
           </w:p>
         </w:tc>
+      </w:tr>
+      <w:tr>
         <w:tc>
           <w:tcPr>
-            <w:tcW w:w="3117" w:type="dxa"/>
+            <w:tcW w:w="2814" w:type="dxa"/>
           </w:tcPr>
           <w:p>
             <w:pPr>
+              <w:jc w:val="center"/>
+              <w:rPr>
+                <w:rFonts w:ascii="Times New Roman" w:hAnsi="Times New Roman" w:cs="Times New Roman"/>
+              </w:rPr>
+            </w:pPr>
+            <w:r>
+              <w:rPr>
+                <w:rFonts w:ascii="Times New Roman" w:hAnsi="Times New Roman" w:cs="Times New Roman"/>
+              </w:rPr>
+              <w:t>Copilot</w:t>
+            </w:r>
+          </w:p>
+        </w:tc>
+        <w:tc>
+          <w:tcPr>
+            <w:tcW w:w="6536" w:type="dxa"/>
+          </w:tcPr>
+          <w:p>
+            <w:pPr>
+              <w:jc w:val="center"/>
               <w:rPr>
                 <w:rFonts w:ascii="Times New Roman" w:hAnsi="Times New Roman" w:cs="Times New Roman"/>
               </w:rPr>
@@ -903,10 +851,10 @@
                 <w:noProof/>
               </w:rPr>
               <w:drawing>
-                <wp:inline distT="0" distB="0" distL="0" distR="0" wp14:anchorId="5602A074" wp14:editId="0D50C876">
-                  <wp:extent cx="1632857" cy="533696"/>
-                  <wp:effectExtent l="0" t="0" r="5715" b="0"/>
-                  <wp:docPr id="1428397826" name="Picture 2" descr="A screenshot of a phone&#10;&#10;AI-generated content may be incorrect."/>
+                <wp:inline distT="0" distB="0" distL="0" distR="0" wp14:anchorId="1EEEB515" wp14:editId="149F43D1">
+                  <wp:extent cx="2253878" cy="2897109"/>
+                  <wp:effectExtent l="0" t="0" r="0" b="0"/>
+                  <wp:docPr id="82034998" name="Picture 4" descr="A screenshot of a computer&#10;&#10;AI-generated content may be incorrect."/>
                   <wp:cNvGraphicFramePr>
                     <a:graphicFrameLocks xmlns:a="http://schemas.openxmlformats.org/drawingml/2006/main" noChangeAspect="1"/>
                   </wp:cNvGraphicFramePr>
@@ -914,7 +862,7 @@
                     <a:graphicData uri="http://schemas.openxmlformats.org/drawingml/2006/picture">
                       <pic:pic xmlns:pic="http://schemas.openxmlformats.org/drawingml/2006/picture">
                         <pic:nvPicPr>
-                          <pic:cNvPr id="1428397826" name="Picture 2" descr="A screenshot of a phone&#10;&#10;AI-generated content may be incorrect."/>
+                          <pic:cNvPr id="82034998" name="Picture 4" descr="A screenshot of a computer&#10;&#10;AI-generated content may be incorrect."/>
                           <pic:cNvPicPr/>
                         </pic:nvPicPr>
                         <pic:blipFill>
@@ -932,7 +880,7 @@
                         <pic:spPr>
                           <a:xfrm>
                             <a:off x="0" y="0"/>
-                            <a:ext cx="1716419" cy="561008"/>
+                            <a:ext cx="2285331" cy="2937538"/>
                           </a:xfrm>
                           <a:prstGeom prst="rect">
                             <a:avLst/>
@@ -945,19 +893,12 @@
               </w:drawing>
             </w:r>
           </w:p>
-          <w:p>
-            <w:pPr>
-              <w:rPr>
-                <w:rFonts w:ascii="Times New Roman" w:hAnsi="Times New Roman" w:cs="Times New Roman"/>
-              </w:rPr>
-            </w:pPr>
-          </w:p>
         </w:tc>
       </w:tr>
     </w:tbl>
     <w:p>
       <w:pPr>
-        <w:spacing w:after="0" w:line="240" w:lineRule="auto"/>
+        <w:pStyle w:val="ListParagraph"/>
         <w:rPr>
           <w:rFonts w:ascii="Times New Roman" w:hAnsi="Times New Roman" w:cs="Times New Roman"/>
         </w:rPr>
@@ -979,6 +920,37 @@
         <w:rPr>
           <w:rFonts w:ascii="Times New Roman" w:hAnsi="Times New Roman" w:cs="Times New Roman"/>
         </w:rPr>
+        <w:t xml:space="preserve">Click </w:t>
+      </w:r>
+      <w:r>
+        <w:rPr>
+          <w:rFonts w:ascii="Times New Roman" w:hAnsi="Times New Roman" w:cs="Times New Roman"/>
+        </w:rPr>
+        <w:t>the copy icon</w:t>
+      </w:r>
+      <w:r>
+        <w:rPr>
+          <w:rFonts w:ascii="Times New Roman" w:hAnsi="Times New Roman" w:cs="Times New Roman"/>
+        </w:rPr>
+        <w:t xml:space="preserve"> below the last conversation.</w:t>
+      </w:r>
+    </w:p>
+    <w:p>
+      <w:pPr>
+        <w:pStyle w:val="ListParagraph"/>
+        <w:numPr>
+          <w:ilvl w:val="0"/>
+          <w:numId w:val="5"/>
+        </w:numPr>
+        <w:spacing w:after="0" w:line="240" w:lineRule="auto"/>
+        <w:rPr>
+          <w:rFonts w:ascii="Times New Roman" w:hAnsi="Times New Roman" w:cs="Times New Roman"/>
+        </w:rPr>
+      </w:pPr>
+      <w:r>
+        <w:rPr>
+          <w:rFonts w:ascii="Times New Roman" w:hAnsi="Times New Roman" w:cs="Times New Roman"/>
+        </w:rPr>
         <w:t>Paste the conversation into a Word document.</w:t>
       </w:r>
     </w:p>
@@ -1015,7 +987,7 @@
           <w:szCs w:val="24"/>
           <w:u w:val="single"/>
         </w:rPr>
-        <w:t xml:space="preserve">Put the </w:t>
+        <w:t>P</w:t>
       </w:r>
       <w:r>
         <w:rPr>
@@ -1026,7 +998,7 @@
           <w:szCs w:val="24"/>
           <w:u w:val="single"/>
         </w:rPr>
-        <w:t>E</w:t>
+        <w:t>aste the Link</w:t>
       </w:r>
       <w:r>
         <w:rPr>
@@ -1037,51 +1009,7 @@
           <w:szCs w:val="24"/>
           <w:u w:val="single"/>
         </w:rPr>
-        <w:t xml:space="preserve">ntire </w:t>
-      </w:r>
-      <w:r>
-        <w:rPr>
-          <w:rFonts w:ascii="Times New Roman" w:hAnsi="Times New Roman" w:cs="Times New Roman"/>
-          <w:b/>
-          <w:bCs/>
-          <w:sz w:val="24"/>
-          <w:szCs w:val="24"/>
-          <w:u w:val="single"/>
-        </w:rPr>
-        <w:t>C</w:t>
-      </w:r>
-      <w:r>
-        <w:rPr>
-          <w:rFonts w:ascii="Times New Roman" w:hAnsi="Times New Roman" w:cs="Times New Roman"/>
-          <w:b/>
-          <w:bCs/>
-          <w:sz w:val="24"/>
-          <w:szCs w:val="24"/>
-          <w:u w:val="single"/>
-        </w:rPr>
-        <w:t xml:space="preserve">hat </w:t>
-      </w:r>
-      <w:r>
-        <w:rPr>
-          <w:rFonts w:ascii="Times New Roman" w:hAnsi="Times New Roman" w:cs="Times New Roman"/>
-          <w:b/>
-          <w:bCs/>
-          <w:sz w:val="24"/>
-          <w:szCs w:val="24"/>
-          <w:u w:val="single"/>
-        </w:rPr>
-        <w:t>H</w:t>
-      </w:r>
-      <w:r>
-        <w:rPr>
-          <w:rFonts w:ascii="Times New Roman" w:hAnsi="Times New Roman" w:cs="Times New Roman"/>
-          <w:b/>
-          <w:bCs/>
-          <w:sz w:val="24"/>
-          <w:szCs w:val="24"/>
-          <w:u w:val="single"/>
-        </w:rPr>
-        <w:t xml:space="preserve">istory </w:t>
+        <w:t xml:space="preserve"> </w:t>
       </w:r>
       <w:r>
         <w:rPr>
@@ -1786,6 +1714,119 @@
     </w:lvl>
   </w:abstractNum>
   <w:abstractNum w:abstractNumId="6" w15:restartNumberingAfterBreak="0">
+    <w:nsid w:val="45A45DC0"/>
+    <w:multiLevelType w:val="multilevel"/>
+    <w:tmpl w:val="B17ECC80"/>
+    <w:lvl w:ilvl="0">
+      <w:start w:val="1"/>
+      <w:numFmt w:val="decimal"/>
+      <w:lvlText w:val="%1."/>
+      <w:lvlJc w:val="left"/>
+      <w:pPr>
+        <w:ind w:left="1440" w:hanging="360"/>
+      </w:pPr>
+      <w:rPr>
+        <w:rFonts w:hint="default"/>
+      </w:rPr>
+    </w:lvl>
+    <w:lvl w:ilvl="1" w:tentative="1">
+      <w:start w:val="1"/>
+      <w:numFmt w:val="bullet"/>
+      <w:lvlText w:val="o"/>
+      <w:lvlJc w:val="left"/>
+      <w:pPr>
+        <w:ind w:left="2160" w:hanging="360"/>
+      </w:pPr>
+      <w:rPr>
+        <w:rFonts w:ascii="Courier New" w:hAnsi="Courier New" w:cs="Courier New" w:hint="default"/>
+      </w:rPr>
+    </w:lvl>
+    <w:lvl w:ilvl="2" w:tentative="1">
+      <w:start w:val="1"/>
+      <w:numFmt w:val="bullet"/>
+      <w:lvlText w:val=""/>
+      <w:lvlJc w:val="left"/>
+      <w:pPr>
+        <w:ind w:left="2880" w:hanging="360"/>
+      </w:pPr>
+      <w:rPr>
+        <w:rFonts w:ascii="Wingdings" w:hAnsi="Wingdings" w:hint="default"/>
+      </w:rPr>
+    </w:lvl>
+    <w:lvl w:ilvl="3" w:tentative="1">
+      <w:start w:val="1"/>
+      <w:numFmt w:val="bullet"/>
+      <w:lvlText w:val=""/>
+      <w:lvlJc w:val="left"/>
+      <w:pPr>
+        <w:ind w:left="3600" w:hanging="360"/>
+      </w:pPr>
+      <w:rPr>
+        <w:rFonts w:ascii="Symbol" w:hAnsi="Symbol" w:hint="default"/>
+      </w:rPr>
+    </w:lvl>
+    <w:lvl w:ilvl="4" w:tentative="1">
+      <w:start w:val="1"/>
+      <w:numFmt w:val="bullet"/>
+      <w:lvlText w:val="o"/>
+      <w:lvlJc w:val="left"/>
+      <w:pPr>
+        <w:ind w:left="4320" w:hanging="360"/>
+      </w:pPr>
+      <w:rPr>
+        <w:rFonts w:ascii="Courier New" w:hAnsi="Courier New" w:cs="Courier New" w:hint="default"/>
+      </w:rPr>
+    </w:lvl>
+    <w:lvl w:ilvl="5" w:tentative="1">
+      <w:start w:val="1"/>
+      <w:numFmt w:val="bullet"/>
+      <w:lvlText w:val=""/>
+      <w:lvlJc w:val="left"/>
+      <w:pPr>
+        <w:ind w:left="5040" w:hanging="360"/>
+      </w:pPr>
+      <w:rPr>
+        <w:rFonts w:ascii="Wingdings" w:hAnsi="Wingdings" w:hint="default"/>
+      </w:rPr>
+    </w:lvl>
+    <w:lvl w:ilvl="6" w:tentative="1">
+      <w:start w:val="1"/>
+      <w:numFmt w:val="bullet"/>
+      <w:lvlText w:val=""/>
+      <w:lvlJc w:val="left"/>
+      <w:pPr>
+        <w:ind w:left="5760" w:hanging="360"/>
+      </w:pPr>
+      <w:rPr>
+        <w:rFonts w:ascii="Symbol" w:hAnsi="Symbol" w:hint="default"/>
+      </w:rPr>
+    </w:lvl>
+    <w:lvl w:ilvl="7" w:tentative="1">
+      <w:start w:val="1"/>
+      <w:numFmt w:val="bullet"/>
+      <w:lvlText w:val="o"/>
+      <w:lvlJc w:val="left"/>
+      <w:pPr>
+        <w:ind w:left="6480" w:hanging="360"/>
+      </w:pPr>
+      <w:rPr>
+        <w:rFonts w:ascii="Courier New" w:hAnsi="Courier New" w:cs="Courier New" w:hint="default"/>
+      </w:rPr>
+    </w:lvl>
+    <w:lvl w:ilvl="8" w:tentative="1">
+      <w:start w:val="1"/>
+      <w:numFmt w:val="bullet"/>
+      <w:lvlText w:val=""/>
+      <w:lvlJc w:val="left"/>
+      <w:pPr>
+        <w:ind w:left="7200" w:hanging="360"/>
+      </w:pPr>
+      <w:rPr>
+        <w:rFonts w:ascii="Wingdings" w:hAnsi="Wingdings" w:hint="default"/>
+      </w:rPr>
+    </w:lvl>
+  </w:abstractNum>
+  <w:abstractNum w:abstractNumId="7" w15:restartNumberingAfterBreak="0">
     <w:nsid w:val="46783EA0"/>
     <w:multiLevelType w:val="multilevel"/>
     <w:tmpl w:val="8F38FA02"/>
@@ -1898,7 +1939,7 @@
       </w:rPr>
     </w:lvl>
   </w:abstractNum>
-  <w:abstractNum w:abstractNumId="7" w15:restartNumberingAfterBreak="0">
+  <w:abstractNum w:abstractNumId="8" w15:restartNumberingAfterBreak="0">
     <w:nsid w:val="58BC7B00"/>
     <w:multiLevelType w:val="hybridMultilevel"/>
     <w:tmpl w:val="0B565BF0"/>
@@ -2027,13 +2068,16 @@
     <w:abstractNumId w:val="2"/>
   </w:num>
   <w:num w:numId="6" w16cid:durableId="200093273">
-    <w:abstractNumId w:val="6"/>
+    <w:abstractNumId w:val="7"/>
   </w:num>
   <w:num w:numId="7" w16cid:durableId="25716504">
-    <w:abstractNumId w:val="7"/>
+    <w:abstractNumId w:val="8"/>
   </w:num>
   <w:num w:numId="8" w16cid:durableId="776751749">
     <w:abstractNumId w:val="0"/>
+  </w:num>
+  <w:num w:numId="9" w16cid:durableId="378210642">
+    <w:abstractNumId w:val="6"/>
   </w:num>
 </w:numbering>
 </file>

</xml_diff>